<commit_message>
Replace generic vibe-coding usage examples with real Data Hawk experience
Swaps the hypothetical bullet points for the actual lived narrative:
the non-technical partner shipping the site and paid services solo,
and the technical evolution into agent-based real-time generation,
professional architecture, and a shared Git repo.

Co-Authored-By: Claude Sonnet 5 <noreply@anthropic.com>
Claude-Session: https://claude.ai/code/session_01TtP2NfbQsYfZUSXTYVo1Lu
</commit_message>
<xml_diff>
--- a/site-prototype/docx-report/relatorio-vibe-coding.docx
+++ b/site-prototype/docx-report/relatorio-vibe-coding.docx
@@ -89,55 +89,55 @@
           <w:sz w:val="22"/>
           <w:szCs w:val="22"/>
         </w:rPr>
-        <w:t xml:space="preserve">Para uma consultoria pequena e sênior como a Data Hawk Solution — sem uma equipe dedicada de desenvolvimento front-end —, o vibe coding tem aplicação direta em pelo menos três frentes:</w:t>
-      </w:r>
-    </w:p>
-    <w:p>
-      <w:pPr>
-        <w:spacing w:after="200" w:line="300"/>
-      </w:pPr>
-      <w:r>
-        <w:rPr>
-          <w:sz w:val="22"/>
-          <w:szCs w:val="22"/>
-        </w:rPr>
-        <w:t xml:space="preserve">Prototipagem rápida de material comercial: landing pages, propostas visuais e materiais de apresentação para clientes podem ser produzidos e iterados em horas, não semanas, sem depender de terceirizar cada ajuste de layout ou texto.</w:t>
-      </w:r>
-    </w:p>
-    <w:p>
-      <w:pPr>
-        <w:spacing w:after="200" w:line="300"/>
-      </w:pPr>
-      <w:r>
-        <w:rPr>
-          <w:sz w:val="22"/>
-          <w:szCs w:val="22"/>
-        </w:rPr>
-        <w:t xml:space="preserve">Provas de conceito técnicas: o próprio motor de geração de políticas de governança via IA e RAG, já em produção, nasceu de um processo semelhante — descrever a necessidade de negócio e deixar que a IA gerasse e ajustasse a implementação, com revisão humana concentrada nas decisões que realmente importam (arquitetura, segurança, sanitização de dados sensíveis).</w:t>
-      </w:r>
-    </w:p>
-    <w:p>
-      <w:pPr>
-        <w:spacing w:after="200" w:line="300"/>
-      </w:pPr>
-      <w:r>
-        <w:rPr>
-          <w:sz w:val="22"/>
-          <w:szCs w:val="22"/>
-        </w:rPr>
-        <w:t xml:space="preserve">Democratização da criação dentro da equipe: pessoas que não programam podem descrever um dashboard, um formulário interno ou um relatório e obter uma primeira versão funcional, reduzindo a dependência de um único especialista técnico para toda demanda pequena.</w:t>
-      </w:r>
-    </w:p>
-    <w:p>
-      <w:pPr>
-        <w:spacing w:after="200" w:line="300"/>
-      </w:pPr>
-      <w:r>
-        <w:rPr>
-          <w:sz w:val="22"/>
-          <w:szCs w:val="22"/>
-        </w:rPr>
-        <w:t xml:space="preserve">O limite importante é que vibe coding acelera a prototipagem e a exploração, mas não substitui rigor de engenharia em sistemas de produção: dados sensíveis, integrações de pagamento e conformidade regulatória continuam exigindo revisão técnica humana antes de ir ao ar — como já é prática no próprio projeto de geração de políticas da empresa, em que a sanitização de dados acontece em camadas e nunca depende só da instrução dada à IA.</w:t>
+        <w:t xml:space="preserve">Essa não é uma possibilidade hipotética: é uma experiência que já estamos vivendo na própria Data Hawk Solution, com dois papéis diferentes se complementando.</w:t>
+      </w:r>
+    </w:p>
+    <w:p>
+      <w:pPr>
+        <w:spacing w:after="200" w:line="300"/>
+      </w:pPr>
+      <w:r>
+        <w:rPr>
+          <w:sz w:val="22"/>
+          <w:szCs w:val="22"/>
+        </w:rPr>
+        <w:t xml:space="preserve">Minha sócia implantou o site institucional da Data Hawk inteiramente através do assistente de IA, sem ter absolutamente nenhum conhecimento técnico de desenvolvimento. Nessa implantação, ela já conseguiu colocar no ar uma versão muito próxima da versão visual final da consultoria — e foi além, implementando também os serviços que a empresa já poderia comercializar online, incluindo formas de pagamento. Isso evidencia o quanto o vibe coding reduz a barreira entre ter uma ideia de negócio e colocá-la de pé, mesmo sem formação técnica.</w:t>
+      </w:r>
+    </w:p>
+    <w:p>
+      <w:pPr>
+        <w:spacing w:after="200" w:line="300"/>
+      </w:pPr>
+      <w:r>
+        <w:rPr>
+          <w:sz w:val="22"/>
+          <w:szCs w:val="22"/>
+        </w:rPr>
+        <w:t xml:space="preserve">Em seguida, assumi o desenvolvimento dos produtos e evoluí o nosso primeiro produto para uma versão que utiliza agentes de IA na geração de conteúdo em tempo real, em vez de um fluxo estático. Por ter mais conhecimento técnico, também implementei componentes de arquitetura mais profissionais, agregando flexibilidade no momento da implantação em cada cliente — decisões de engenharia (modularidade, configuração por ambiente, isolamento de dados sensíveis) que vão além do que o vibe coding resolve sozinho.</w:t>
+      </w:r>
+    </w:p>
+    <w:p>
+      <w:pPr>
+        <w:spacing w:after="200" w:line="300"/>
+      </w:pPr>
+      <w:r>
+        <w:rPr>
+          <w:sz w:val="22"/>
+          <w:szCs w:val="22"/>
+        </w:rPr>
+        <w:t xml:space="preserve">Outro ponto relevante desse processo foi a criação de um repositório no Git, que permitiu centralizar o código e passar a trabalhar em equipe de forma organizada, com histórico de mudanças e um ponto único de verdade sobre o que está em produção, em vez de cada pessoa guardando sua própria versão do projeto.</w:t>
+      </w:r>
+    </w:p>
+    <w:p>
+      <w:pPr>
+        <w:spacing w:after="200" w:line="300"/>
+      </w:pPr>
+      <w:r>
+        <w:rPr>
+          <w:sz w:val="22"/>
+          <w:szCs w:val="22"/>
+        </w:rPr>
+        <w:t xml:space="preserve">Essa combinação resume bem o potencial do vibe coding para uma consultoria pequena como a Data Hawk Solution: ele abre a porta para que qualquer pessoa da equipe — técnica ou não — coloque uma ideia de negócio em produção rapidamente, enquanto a experiência técnica continua sendo o que garante que essa ideia evolua com a robustez, a flexibilidade e a governança que um cliente regulado exige.</w:t>
       </w:r>
     </w:p>
     <w:p>

</xml_diff>

<commit_message>
Shorten the Resumo do processo section in the vibe-coding report
Condenses three paragraphs into two, trimming repetition while
keeping the core explanation and the three-layer process description.

Co-Authored-By: Claude Sonnet 5 <noreply@anthropic.com>
Claude-Session: https://claude.ai/code/session_01TtP2NfbQsYfZUSXTYVo1Lu
</commit_message>
<xml_diff>
--- a/site-prototype/docx-report/relatorio-vibe-coding.docx
+++ b/site-prototype/docx-report/relatorio-vibe-coding.docx
@@ -44,7 +44,7 @@
           <w:sz w:val="22"/>
           <w:szCs w:val="22"/>
         </w:rPr>
-        <w:t xml:space="preserve">O trabalho consistiu em transformar uma ideia descrita em linguagem natural — um site institucional para uma consultoria de governança de dados e IA — em um protótipo visual e, em seguida, em uma página web funcional, usando um assistente de IA (Claude) como par de desenvolvimento ao longo de todo o processo. Não houve escrita manual de código em nenhuma etapa: cada resultado foi produzido a partir de instruções em português descrevendo a intenção ("quero uma página inicial, com apresentação da consultoria, e subpáginas de serviços e contato, com interface limpa e moderna"), refinadas por rodadas curtas de revisão e ajuste.</w:t>
+        <w:t xml:space="preserve">O trabalho transformou uma ideia em linguagem natural — um site institucional para uma consultoria de governança de dados e IA — em um protótipo visual e, depois, em uma página web funcional, usando um assistente de IA (Claude) como par de desenvolvimento do início ao fim, sem escrita manual de código. Esse é o núcleo do "vibe coding": em vez de especificar sintaxe e arquitetura de antemão, comunica-se a intenção e o resultado desejado, e o papel humano se desloca de quem escreve cada linha para quem define o objetivo, avalia o resultado e corrige o rumo.</w:t>
       </w:r>
     </w:p>
     <w:p>
@@ -56,19 +56,7 @@
           <w:sz w:val="22"/>
           <w:szCs w:val="22"/>
         </w:rPr>
-        <w:t xml:space="preserve">Esse é o núcleo do que se chama de "vibe coding": em vez de especificar sintaxe, estruturas de dados ou arquitetura de antemão, o desenvolvedor comunica a intenção e o resultado desejado, e deixa que o modelo gere o artefato (design, texto, código), revisando e redirecionando pelo resultado obtido, não pelo caminho percorrido. O papel humano não desaparece — desloca-se: de quem escreve cada linha para quem define objetivo, avalia o resultado, corrige rumo e garante que o conteúdo gerado seja verdadeiro e coerente com a realidade da empresa, e não apenas texto genérico de marketing.</w:t>
-      </w:r>
-    </w:p>
-    <w:p>
-      <w:pPr>
-        <w:spacing w:after="200" w:line="300"/>
-      </w:pPr>
-      <w:r>
-        <w:rPr>
-          <w:sz w:val="22"/>
-          <w:szCs w:val="22"/>
-        </w:rPr>
-        <w:t xml:space="preserve">Na prática, o processo teve três camadas: (1) um esboço estrutural de baixa fidelidade da ideia original, para validar a organização do conteúdo antes de investir em visual; (2) um protótipo visual de alta fidelidade (tipografia, cores, ícones, hierarquia), construído em uma ferramenta de design; e (3) a tradução desse protótipo em uma página HTML/CSS real, navegável e testável localmente. Cada camada foi revisada antes de avançar para a próxima — inclusive com uma etapa de conferência automatizada do conteúdo gerado, para pegar inconsistências de texto e de layout antes da entrega.</w:t>
+        <w:t xml:space="preserve">Na prática, o processo teve três camadas, cada uma revisada antes de avançar para a próxima: um esboço estrutural de baixa fidelidade da ideia original, um protótipo visual de alta fidelidade e, por fim, a tradução desse protótipo em uma página HTML/CSS real, navegável e testável localmente.</w:t>
       </w:r>
     </w:p>
     <w:p>

</xml_diff>

<commit_message>
Condense the entire vibe-coding report to under 500 words
Trims both the Resumo and Como a empresa poderia usar sections to
stay within a 500-word cap for the whole text, keeping the real
Data Hawk narrative and the two figures intact.

Co-Authored-By: Claude Sonnet 5 <noreply@anthropic.com>
Claude-Session: https://claude.ai/code/session_01TtP2NfbQsYfZUSXTYVo1Lu
</commit_message>
<xml_diff>
--- a/site-prototype/docx-report/relatorio-vibe-coding.docx
+++ b/site-prototype/docx-report/relatorio-vibe-coding.docx
@@ -44,19 +44,7 @@
           <w:sz w:val="22"/>
           <w:szCs w:val="22"/>
         </w:rPr>
-        <w:t xml:space="preserve">O trabalho transformou uma ideia em linguagem natural — um site institucional para uma consultoria de governança de dados e IA — em um protótipo visual e, depois, em uma página web funcional, usando um assistente de IA (Claude) como par de desenvolvimento do início ao fim, sem escrita manual de código. Esse é o núcleo do "vibe coding": em vez de especificar sintaxe e arquitetura de antemão, comunica-se a intenção e o resultado desejado, e o papel humano se desloca de quem escreve cada linha para quem define o objetivo, avalia o resultado e corrige o rumo.</w:t>
-      </w:r>
-    </w:p>
-    <w:p>
-      <w:pPr>
-        <w:spacing w:after="200" w:line="300"/>
-      </w:pPr>
-      <w:r>
-        <w:rPr>
-          <w:sz w:val="22"/>
-          <w:szCs w:val="22"/>
-        </w:rPr>
-        <w:t xml:space="preserve">Na prática, o processo teve três camadas, cada uma revisada antes de avançar para a próxima: um esboço estrutural de baixa fidelidade da ideia original, um protótipo visual de alta fidelidade e, por fim, a tradução desse protótipo em uma página HTML/CSS real, navegável e testável localmente.</w:t>
+        <w:t xml:space="preserve">O trabalho transformou uma ideia em linguagem natural — um site institucional para uma consultoria de governança de dados e IA — em um protótipo visual e, depois, em uma página web funcional, usando a IA (Claude) como par de desenvolvimento do início ao fim, sem escrita manual de código. Esse é o núcleo do "vibe coding": comunica-se a intenção, e o papel humano se desloca de quem escreve cada linha para quem define o objetivo, avalia o resultado e corrige o rumo. O processo teve três camadas revisadas em sequência: um esboço estrutural de baixa fidelidade, um protótipo visual de alta fidelidade e, por fim, a página HTML/CSS real, navegável e testável localmente.</w:t>
       </w:r>
     </w:p>
     <w:p>
@@ -77,7 +65,7 @@
           <w:sz w:val="22"/>
           <w:szCs w:val="22"/>
         </w:rPr>
-        <w:t xml:space="preserve">Essa não é uma possibilidade hipotética: é uma experiência que já estamos vivendo na própria Data Hawk Solution, com dois papéis diferentes se complementando.</w:t>
+        <w:t xml:space="preserve">Essa não é uma possibilidade hipotética: é uma experiência que já vivemos na Data Hawk Solution, com dois papéis se complementando.</w:t>
       </w:r>
     </w:p>
     <w:p>
@@ -89,7 +77,7 @@
           <w:sz w:val="22"/>
           <w:szCs w:val="22"/>
         </w:rPr>
-        <w:t xml:space="preserve">Minha sócia implantou o site institucional da Data Hawk inteiramente através do assistente de IA, sem ter absolutamente nenhum conhecimento técnico de desenvolvimento. Nessa implantação, ela já conseguiu colocar no ar uma versão muito próxima da versão visual final da consultoria — e foi além, implementando também os serviços que a empresa já poderia comercializar online, incluindo formas de pagamento. Isso evidencia o quanto o vibe coding reduz a barreira entre ter uma ideia de negócio e colocá-la de pé, mesmo sem formação técnica.</w:t>
+        <w:t xml:space="preserve">Minha sócia implantou o site institucional da Data Hawk inteiramente pelo assistente de IA, sem nenhum conhecimento técnico de desenvolvimento, chegando a uma versão muito próxima da final e implementando até os serviços comercializáveis online, incluindo formas de pagamento — evidência de como o vibe coding reduz a barreira entre ter uma ideia de negócio e colocá-la de pé.</w:t>
       </w:r>
     </w:p>
     <w:p>
@@ -101,7 +89,7 @@
           <w:sz w:val="22"/>
           <w:szCs w:val="22"/>
         </w:rPr>
-        <w:t xml:space="preserve">Em seguida, assumi o desenvolvimento dos produtos e evoluí o nosso primeiro produto para uma versão que utiliza agentes de IA na geração de conteúdo em tempo real, em vez de um fluxo estático. Por ter mais conhecimento técnico, também implementei componentes de arquitetura mais profissionais, agregando flexibilidade no momento da implantação em cada cliente — decisões de engenharia (modularidade, configuração por ambiente, isolamento de dados sensíveis) que vão além do que o vibe coding resolve sozinho.</w:t>
+        <w:t xml:space="preserve">Em seguida, assumi o desenvolvimento dos produtos e evoluí o nosso primeiro produto para uma versão que usa agentes de IA na geração de conteúdo em tempo real. Por ter mais conhecimento técnico, implementei também componentes de arquitetura mais profissionais, agregando flexibilidade na implantação em cada cliente — decisões de engenharia que vão além do que o vibe coding resolve sozinho.</w:t>
       </w:r>
     </w:p>
     <w:p>
@@ -113,7 +101,7 @@
           <w:sz w:val="22"/>
           <w:szCs w:val="22"/>
         </w:rPr>
-        <w:t xml:space="preserve">Outro ponto relevante desse processo foi a criação de um repositório no Git, que permitiu centralizar o código e passar a trabalhar em equipe de forma organizada, com histórico de mudanças e um ponto único de verdade sobre o que está em produção, em vez de cada pessoa guardando sua própria versão do projeto.</w:t>
+        <w:t xml:space="preserve">Outro ponto relevante foi a criação de um repositório no Git, que centralizou o código e organizou o trabalho em equipe, com histórico de mudanças e um ponto único de verdade sobre o que está em produção.</w:t>
       </w:r>
     </w:p>
     <w:p>
@@ -125,7 +113,7 @@
           <w:sz w:val="22"/>
           <w:szCs w:val="22"/>
         </w:rPr>
-        <w:t xml:space="preserve">Essa combinação resume bem o potencial do vibe coding para uma consultoria pequena como a Data Hawk Solution: ele abre a porta para que qualquer pessoa da equipe — técnica ou não — coloque uma ideia de negócio em produção rapidamente, enquanto a experiência técnica continua sendo o que garante que essa ideia evolua com a robustez, a flexibilidade e a governança que um cliente regulado exige.</w:t>
+        <w:t xml:space="preserve">Essa combinação resume o potencial do vibe coding para uma consultoria pequena como a Data Hawk: ele abre a porta para qualquer pessoa da equipe colocar uma ideia em produção rapidamente, enquanto a experiência técnica garante a robustez, a flexibilidade e a governança que um cliente regulado exige.</w:t>
       </w:r>
     </w:p>
     <w:p>

</xml_diff>